<commit_message>
diagramas de actividad 2
</commit_message>
<xml_diff>
--- a/docs/diagrams/TABLAS DE ESPECIFICACION.docx
+++ b/docs/diagrams/TABLAS DE ESPECIFICACION.docx
@@ -2526,7 +2526,11 @@
           <w:tcPr>
             <w:tcW w:w="4247" w:type="dxa"/>
           </w:tcPr>
-          <w:p/>
+          <w:p>
+            <w:r>
+              <w:t>Un usuario autenticado crea una nueva lista de videojuegos desde la pestaña "Listas" de su propio perfil.</w:t>
+            </w:r>
+          </w:p>
         </w:tc>
       </w:tr>
       <w:tr>
@@ -2554,7 +2558,11 @@
           <w:tcPr>
             <w:tcW w:w="4247" w:type="dxa"/>
           </w:tcPr>
-          <w:p/>
+          <w:p>
+            <w:r>
+              <w:t>Usuario Registrado</w:t>
+            </w:r>
+          </w:p>
         </w:tc>
       </w:tr>
       <w:tr>
@@ -2582,7 +2590,19 @@
           <w:tcPr>
             <w:tcW w:w="4247" w:type="dxa"/>
           </w:tcPr>
-          <w:p/>
+          <w:p>
+            <w:r>
+              <w:t xml:space="preserve">El usuario debe estar </w:t>
+            </w:r>
+            <w:proofErr w:type="spellStart"/>
+            <w:r>
+              <w:t>logueado</w:t>
+            </w:r>
+            <w:proofErr w:type="spellEnd"/>
+            <w:r>
+              <w:t xml:space="preserve"> y estar visualizando su propio perfil</w:t>
+            </w:r>
+          </w:p>
         </w:tc>
       </w:tr>
       <w:tr>
@@ -2618,26 +2638,181 @@
                 <w:numId w:val="9"/>
               </w:numPr>
             </w:pPr>
-          </w:p>
-        </w:tc>
-      </w:tr>
-      <w:tr>
-        <w:tc>
-          <w:tcPr>
-            <w:tcW w:w="4247" w:type="dxa"/>
-          </w:tcPr>
-          <w:p>
-            <w:pPr>
-              <w:rPr>
-                <w:b/>
-                <w:bCs/>
-              </w:rPr>
-            </w:pPr>
-            <w:r>
-              <w:rPr>
-                <w:b/>
-                <w:bCs/>
-              </w:rPr>
+            <w:r>
+              <w:t>El usuario navega a la pestaña "Listas" y pulsa "Crear lista".</w:t>
+            </w:r>
+          </w:p>
+          <w:p>
+            <w:pPr>
+              <w:pStyle w:val="Prrafodelista"/>
+            </w:pPr>
+          </w:p>
+          <w:p>
+            <w:pPr>
+              <w:pStyle w:val="Prrafodelista"/>
+              <w:numPr>
+                <w:ilvl w:val="0"/>
+                <w:numId w:val="9"/>
+              </w:numPr>
+            </w:pPr>
+            <w:r>
+              <w:t>El sistema despliega el modal.</w:t>
+            </w:r>
+            <w:r>
+              <w:br/>
+            </w:r>
+          </w:p>
+          <w:p>
+            <w:pPr>
+              <w:pStyle w:val="Prrafodelista"/>
+              <w:numPr>
+                <w:ilvl w:val="0"/>
+                <w:numId w:val="9"/>
+              </w:numPr>
+            </w:pPr>
+            <w:r>
+              <w:t>El usuario introduce los datos de la lista y pulsa "Guardar".</w:t>
+            </w:r>
+            <w:r>
+              <w:br/>
+            </w:r>
+          </w:p>
+          <w:p>
+            <w:pPr>
+              <w:pStyle w:val="Prrafodelista"/>
+              <w:numPr>
+                <w:ilvl w:val="0"/>
+                <w:numId w:val="9"/>
+              </w:numPr>
+            </w:pPr>
+            <w:r>
+              <w:t>El sistema envía una petición de creación al servidor.</w:t>
+            </w:r>
+            <w:r>
+              <w:br/>
+            </w:r>
+          </w:p>
+          <w:p>
+            <w:pPr>
+              <w:pStyle w:val="Prrafodelista"/>
+              <w:numPr>
+                <w:ilvl w:val="0"/>
+                <w:numId w:val="9"/>
+              </w:numPr>
+            </w:pPr>
+            <w:r>
+              <w:t>El servidor registra la nueva lista en la base de datos y responde con éxito.</w:t>
+            </w:r>
+          </w:p>
+          <w:p>
+            <w:pPr>
+              <w:pStyle w:val="Prrafodelista"/>
+              <w:numPr>
+                <w:ilvl w:val="0"/>
+                <w:numId w:val="9"/>
+              </w:numPr>
+            </w:pPr>
+            <w:r>
+              <w:br/>
+            </w:r>
+          </w:p>
+          <w:p>
+            <w:pPr>
+              <w:pStyle w:val="Prrafodelista"/>
+              <w:numPr>
+                <w:ilvl w:val="0"/>
+                <w:numId w:val="9"/>
+              </w:numPr>
+            </w:pPr>
+            <w:r>
+              <w:t>6. El sistema cierra el modal.</w:t>
+            </w:r>
+          </w:p>
+          <w:p>
+            <w:pPr>
+              <w:pStyle w:val="Prrafodelista"/>
+              <w:numPr>
+                <w:ilvl w:val="0"/>
+                <w:numId w:val="9"/>
+              </w:numPr>
+            </w:pPr>
+            <w:r>
+              <w:br/>
+            </w:r>
+          </w:p>
+          <w:p>
+            <w:pPr>
+              <w:pStyle w:val="Prrafodelista"/>
+              <w:numPr>
+                <w:ilvl w:val="0"/>
+                <w:numId w:val="9"/>
+              </w:numPr>
+            </w:pPr>
+            <w:r>
+              <w:t>7. El sistema ejecuta una recarga automática de los datos del perfil (</w:t>
+            </w:r>
+            <w:proofErr w:type="spellStart"/>
+            <w:r>
+              <w:t>loadProfileData</w:t>
+            </w:r>
+            <w:proofErr w:type="spellEnd"/>
+            <w:r>
+              <w:t>).</w:t>
+            </w:r>
+          </w:p>
+          <w:p>
+            <w:pPr>
+              <w:pStyle w:val="Prrafodelista"/>
+              <w:numPr>
+                <w:ilvl w:val="0"/>
+                <w:numId w:val="9"/>
+              </w:numPr>
+            </w:pPr>
+            <w:r>
+              <w:br/>
+            </w:r>
+          </w:p>
+          <w:p>
+            <w:pPr>
+              <w:pStyle w:val="Prrafodelista"/>
+              <w:numPr>
+                <w:ilvl w:val="0"/>
+                <w:numId w:val="9"/>
+              </w:numPr>
+            </w:pPr>
+            <w:r>
+              <w:t>8. El servidor devuelve las listas actualizadas y el sistema las renderiza en pantalla.</w:t>
+            </w:r>
+          </w:p>
+          <w:p>
+            <w:pPr>
+              <w:pStyle w:val="Prrafodelista"/>
+              <w:numPr>
+                <w:ilvl w:val="0"/>
+                <w:numId w:val="9"/>
+              </w:numPr>
+            </w:pPr>
+          </w:p>
+        </w:tc>
+      </w:tr>
+      <w:tr>
+        <w:tc>
+          <w:tcPr>
+            <w:tcW w:w="4247" w:type="dxa"/>
+          </w:tcPr>
+          <w:p>
+            <w:pPr>
+              <w:rPr>
+                <w:b/>
+                <w:bCs/>
+              </w:rPr>
+            </w:pPr>
+            <w:r>
+              <w:rPr>
+                <w:b/>
+                <w:bCs/>
+              </w:rPr>
+              <w:lastRenderedPageBreak/>
               <w:t>POSTCONDICIONES</w:t>
             </w:r>
           </w:p>
@@ -2646,7 +2821,17 @@
           <w:tcPr>
             <w:tcW w:w="4247" w:type="dxa"/>
           </w:tcPr>
-          <w:p/>
+          <w:p>
+            <w:r>
+              <w:t xml:space="preserve">La lista se ha creado en la </w:t>
+            </w:r>
+            <w:r>
+              <w:t>BBDD</w:t>
+            </w:r>
+            <w:r>
+              <w:t>, vinculada al usuario y aparece en la UI.</w:t>
+            </w:r>
+          </w:p>
         </w:tc>
       </w:tr>
       <w:tr>
@@ -2674,7 +2859,69 @@
           <w:tcPr>
             <w:tcW w:w="4247" w:type="dxa"/>
           </w:tcPr>
-          <w:p/>
+          <w:p>
+            <w:pPr>
+              <w:pStyle w:val="Prrafodelista"/>
+              <w:numPr>
+                <w:ilvl w:val="0"/>
+                <w:numId w:val="2"/>
+              </w:numPr>
+            </w:pPr>
+            <w:r>
+              <w:rPr>
+                <w:b/>
+                <w:bCs/>
+              </w:rPr>
+              <w:t>Cierre voluntario:</w:t>
+            </w:r>
+            <w:r>
+              <w:t xml:space="preserve"> El usuario pulsa "Cancelar" o cierra el modal. El estado </w:t>
+            </w:r>
+            <w:proofErr w:type="spellStart"/>
+            <w:r>
+              <w:t>isModalOpen</w:t>
+            </w:r>
+            <w:proofErr w:type="spellEnd"/>
+            <w:r>
+              <w:t xml:space="preserve"> pasa a false y no se hace petición a la API.</w:t>
+            </w:r>
+          </w:p>
+          <w:p>
+            <w:pPr>
+              <w:ind w:left="360"/>
+            </w:pPr>
+          </w:p>
+          <w:p>
+            <w:pPr>
+              <w:pStyle w:val="Prrafodelista"/>
+              <w:numPr>
+                <w:ilvl w:val="0"/>
+                <w:numId w:val="2"/>
+              </w:numPr>
+            </w:pPr>
+            <w:r>
+              <w:rPr>
+                <w:b/>
+                <w:bCs/>
+              </w:rPr>
+              <w:t>Error al guardar:</w:t>
+            </w:r>
+            <w:r>
+              <w:t xml:space="preserve"> Si la API devuelve un error</w:t>
+            </w:r>
+            <w:r>
+              <w:t xml:space="preserve">, </w:t>
+            </w:r>
+            <w:r>
+              <w:t>el componente muestra el</w:t>
+            </w:r>
+            <w:r>
+              <w:t xml:space="preserve"> </w:t>
+            </w:r>
+            <w:r>
+              <w:t>error y el modal no se cierra para permitir correcciones.</w:t>
+            </w:r>
+          </w:p>
         </w:tc>
       </w:tr>
     </w:tbl>
@@ -2706,103 +2953,103 @@
                 <w:b/>
                 <w:bCs/>
               </w:rPr>
+              <w:t>NOMBRE DEL CASO</w:t>
+            </w:r>
+          </w:p>
+        </w:tc>
+        <w:tc>
+          <w:tcPr>
+            <w:tcW w:w="4247" w:type="dxa"/>
+          </w:tcPr>
+          <w:p>
+            <w:r>
+              <w:t>Añadir juego a lista</w:t>
+            </w:r>
+          </w:p>
+        </w:tc>
+      </w:tr>
+      <w:tr>
+        <w:tc>
+          <w:tcPr>
+            <w:tcW w:w="4247" w:type="dxa"/>
+          </w:tcPr>
+          <w:p>
+            <w:pPr>
+              <w:rPr>
+                <w:b/>
+                <w:bCs/>
+              </w:rPr>
+            </w:pPr>
+            <w:r>
+              <w:rPr>
+                <w:b/>
+                <w:bCs/>
+              </w:rPr>
+              <w:t>DESCRIPCION</w:t>
+            </w:r>
+          </w:p>
+        </w:tc>
+        <w:tc>
+          <w:tcPr>
+            <w:tcW w:w="4247" w:type="dxa"/>
+          </w:tcPr>
+          <w:p>
+            <w:r>
+              <w:t>El usuario abre el modal de listas para añadir el juego actual a una de sus listas personalizadas creadas previamente.</w:t>
+            </w:r>
+          </w:p>
+        </w:tc>
+      </w:tr>
+      <w:tr>
+        <w:tc>
+          <w:tcPr>
+            <w:tcW w:w="4247" w:type="dxa"/>
+          </w:tcPr>
+          <w:p>
+            <w:pPr>
+              <w:rPr>
+                <w:b/>
+                <w:bCs/>
+              </w:rPr>
+            </w:pPr>
+            <w:r>
+              <w:rPr>
+                <w:b/>
+                <w:bCs/>
+              </w:rPr>
+              <w:t>ACTORES</w:t>
+            </w:r>
+          </w:p>
+        </w:tc>
+        <w:tc>
+          <w:tcPr>
+            <w:tcW w:w="4247" w:type="dxa"/>
+          </w:tcPr>
+          <w:p>
+            <w:r>
+              <w:t>Usuario Registrado</w:t>
+            </w:r>
+          </w:p>
+        </w:tc>
+      </w:tr>
+      <w:tr>
+        <w:tc>
+          <w:tcPr>
+            <w:tcW w:w="4247" w:type="dxa"/>
+          </w:tcPr>
+          <w:p>
+            <w:pPr>
+              <w:rPr>
+                <w:b/>
+                <w:bCs/>
+              </w:rPr>
+            </w:pPr>
+            <w:r>
+              <w:rPr>
+                <w:b/>
+                <w:bCs/>
+              </w:rPr>
               <w:lastRenderedPageBreak/>
-              <w:t>NOMBRE DEL CASO</w:t>
-            </w:r>
-          </w:p>
-        </w:tc>
-        <w:tc>
-          <w:tcPr>
-            <w:tcW w:w="4247" w:type="dxa"/>
-          </w:tcPr>
-          <w:p>
-            <w:r>
-              <w:t>Añadir juego a lista</w:t>
-            </w:r>
-          </w:p>
-        </w:tc>
-      </w:tr>
-      <w:tr>
-        <w:tc>
-          <w:tcPr>
-            <w:tcW w:w="4247" w:type="dxa"/>
-          </w:tcPr>
-          <w:p>
-            <w:pPr>
-              <w:rPr>
-                <w:b/>
-                <w:bCs/>
-              </w:rPr>
-            </w:pPr>
-            <w:r>
-              <w:rPr>
-                <w:b/>
-                <w:bCs/>
-              </w:rPr>
-              <w:t>DESCRIPCION</w:t>
-            </w:r>
-          </w:p>
-        </w:tc>
-        <w:tc>
-          <w:tcPr>
-            <w:tcW w:w="4247" w:type="dxa"/>
-          </w:tcPr>
-          <w:p>
-            <w:r>
-              <w:t>El usuario abre el modal de listas para añadir el juego actual a una de sus listas personalizadas creadas previamente.</w:t>
-            </w:r>
-          </w:p>
-        </w:tc>
-      </w:tr>
-      <w:tr>
-        <w:tc>
-          <w:tcPr>
-            <w:tcW w:w="4247" w:type="dxa"/>
-          </w:tcPr>
-          <w:p>
-            <w:pPr>
-              <w:rPr>
-                <w:b/>
-                <w:bCs/>
-              </w:rPr>
-            </w:pPr>
-            <w:r>
-              <w:rPr>
-                <w:b/>
-                <w:bCs/>
-              </w:rPr>
-              <w:t>ACTORES</w:t>
-            </w:r>
-          </w:p>
-        </w:tc>
-        <w:tc>
-          <w:tcPr>
-            <w:tcW w:w="4247" w:type="dxa"/>
-          </w:tcPr>
-          <w:p>
-            <w:r>
-              <w:t>Usuario Registrado</w:t>
-            </w:r>
-          </w:p>
-        </w:tc>
-      </w:tr>
-      <w:tr>
-        <w:tc>
-          <w:tcPr>
-            <w:tcW w:w="4247" w:type="dxa"/>
-          </w:tcPr>
-          <w:p>
-            <w:pPr>
-              <w:rPr>
-                <w:b/>
-                <w:bCs/>
-              </w:rPr>
-            </w:pPr>
-            <w:r>
-              <w:rPr>
-                <w:b/>
-                <w:bCs/>
-              </w:rPr>
               <w:t>PRECONDICIONES</w:t>
             </w:r>
           </w:p>
@@ -3215,15 +3462,47 @@
                 <w:b/>
                 <w:bCs/>
               </w:rPr>
+              <w:t>SECUENCIA NORMAL</w:t>
+            </w:r>
+          </w:p>
+        </w:tc>
+        <w:tc>
+          <w:tcPr>
+            <w:tcW w:w="4247" w:type="dxa"/>
+          </w:tcPr>
+          <w:p>
+            <w:pPr>
+              <w:pStyle w:val="Prrafodelista"/>
+              <w:numPr>
+                <w:ilvl w:val="0"/>
+                <w:numId w:val="11"/>
+              </w:numPr>
+            </w:pPr>
+            <w:r>
+              <w:t>El usuario pulsa "Escribir Reseña" para desplegar el formulario.</w:t>
+            </w:r>
+            <w:r>
+              <w:br/>
+            </w:r>
+          </w:p>
+          <w:p/>
+          <w:p/>
+          <w:p>
+            <w:pPr>
+              <w:pStyle w:val="Prrafodelista"/>
+              <w:numPr>
+                <w:ilvl w:val="0"/>
+                <w:numId w:val="11"/>
+              </w:numPr>
+            </w:pPr>
+            <w:r>
               <w:lastRenderedPageBreak/>
-              <w:t>SECUENCIA NORMAL</w:t>
-            </w:r>
-          </w:p>
-        </w:tc>
-        <w:tc>
-          <w:tcPr>
-            <w:tcW w:w="4247" w:type="dxa"/>
-          </w:tcPr>
+              <w:t>Introduce una puntuación (estrellas) y el texto de la reseña.</w:t>
+            </w:r>
+            <w:r>
+              <w:br/>
+            </w:r>
+          </w:p>
           <w:p>
             <w:pPr>
               <w:pStyle w:val="Prrafodelista"/>
@@ -3233,7 +3512,7 @@
               </w:numPr>
             </w:pPr>
             <w:r>
-              <w:t>El usuario pulsa "Escribir Reseña" para desplegar el formulario.</w:t>
+              <w:t xml:space="preserve"> Pulsa "Publicar Reseña".</w:t>
             </w:r>
             <w:r>
               <w:br/>
@@ -3248,7 +3527,15 @@
               </w:numPr>
             </w:pPr>
             <w:r>
-              <w:t>Introduce una puntuación (estrellas) y el texto de la reseña.</w:t>
+              <w:t xml:space="preserve">El sistema valida que el usuario esté </w:t>
+            </w:r>
+            <w:proofErr w:type="spellStart"/>
+            <w:r>
+              <w:t>logueado</w:t>
+            </w:r>
+            <w:proofErr w:type="spellEnd"/>
+            <w:r>
+              <w:t xml:space="preserve"> y que el texto no esté vacío.</w:t>
             </w:r>
             <w:r>
               <w:br/>
@@ -3261,9 +3548,27 @@
                 <w:ilvl w:val="0"/>
                 <w:numId w:val="11"/>
               </w:numPr>
-            </w:pPr>
-            <w:r>
-              <w:t xml:space="preserve"> Pulsa "Publicar Reseña".</w:t>
+              <w:rPr>
+                <w:highlight w:val="red"/>
+              </w:rPr>
+            </w:pPr>
+            <w:r>
+              <w:rPr>
+                <w:highlight w:val="red"/>
+              </w:rPr>
+              <w:t>El sistema convierte la nota de base 5 a base 10</w:t>
+            </w:r>
+          </w:p>
+          <w:p>
+            <w:pPr>
+              <w:pStyle w:val="Prrafodelista"/>
+              <w:numPr>
+                <w:ilvl w:val="0"/>
+                <w:numId w:val="11"/>
+              </w:numPr>
+            </w:pPr>
+            <w:r>
+              <w:t>El sistema envía los datos al servidor.</w:t>
             </w:r>
             <w:r>
               <w:br/>
@@ -3278,15 +3583,13 @@
               </w:numPr>
             </w:pPr>
             <w:r>
-              <w:t xml:space="preserve">El sistema valida que el usuario esté </w:t>
-            </w:r>
-            <w:proofErr w:type="spellStart"/>
-            <w:r>
-              <w:t>logueado</w:t>
-            </w:r>
-            <w:proofErr w:type="spellEnd"/>
-            <w:r>
-              <w:t xml:space="preserve"> y que el texto no esté vacío.</w:t>
+              <w:t xml:space="preserve">El servidor guarda la reseña en la </w:t>
+            </w:r>
+            <w:r>
+              <w:t>BBDD</w:t>
+            </w:r>
+            <w:r>
+              <w:t xml:space="preserve"> y responde con éxito.</w:t>
             </w:r>
             <w:r>
               <w:br/>
@@ -3299,15 +3602,12 @@
                 <w:ilvl w:val="0"/>
                 <w:numId w:val="11"/>
               </w:numPr>
-              <w:rPr>
-                <w:highlight w:val="red"/>
-              </w:rPr>
-            </w:pPr>
-            <w:r>
-              <w:rPr>
-                <w:highlight w:val="red"/>
-              </w:rPr>
-              <w:t>El sistema convierte la nota de base 5 a base 10</w:t>
+            </w:pPr>
+            <w:r>
+              <w:t>El sistema muestra "Reseña creada", limpia y oculta el formulario.</w:t>
+            </w:r>
+            <w:r>
+              <w:br/>
             </w:r>
           </w:p>
           <w:p>
@@ -3319,57 +3619,6 @@
               </w:numPr>
             </w:pPr>
             <w:r>
-              <w:t>El sistema envía los datos al servidor.</w:t>
-            </w:r>
-            <w:r>
-              <w:br/>
-            </w:r>
-          </w:p>
-          <w:p>
-            <w:pPr>
-              <w:pStyle w:val="Prrafodelista"/>
-              <w:numPr>
-                <w:ilvl w:val="0"/>
-                <w:numId w:val="11"/>
-              </w:numPr>
-            </w:pPr>
-            <w:r>
-              <w:t xml:space="preserve">El servidor guarda la reseña en la </w:t>
-            </w:r>
-            <w:r>
-              <w:t>BBDD</w:t>
-            </w:r>
-            <w:r>
-              <w:t xml:space="preserve"> y responde con éxito.</w:t>
-            </w:r>
-            <w:r>
-              <w:br/>
-            </w:r>
-          </w:p>
-          <w:p>
-            <w:pPr>
-              <w:pStyle w:val="Prrafodelista"/>
-              <w:numPr>
-                <w:ilvl w:val="0"/>
-                <w:numId w:val="11"/>
-              </w:numPr>
-            </w:pPr>
-            <w:r>
-              <w:t>El sistema muestra "Reseña creada", limpia y oculta el formulario.</w:t>
-            </w:r>
-            <w:r>
-              <w:br/>
-            </w:r>
-          </w:p>
-          <w:p>
-            <w:pPr>
-              <w:pStyle w:val="Prrafodelista"/>
-              <w:numPr>
-                <w:ilvl w:val="0"/>
-                <w:numId w:val="11"/>
-              </w:numPr>
-            </w:pPr>
-            <w:r>
               <w:t>Tras 500ms, el sistema vuelve a solicitar al servidor la lista de reseñas actualizada para mostrarla en pantalla.</w:t>
             </w:r>
           </w:p>
@@ -3392,6 +3641,7 @@
                 <w:b/>
                 <w:bCs/>
               </w:rPr>
+              <w:lastRenderedPageBreak/>
               <w:t>POSTCONDICIONES</w:t>
             </w:r>
           </w:p>
@@ -3606,7 +3856,13 @@
           </w:tcPr>
           <w:p>
             <w:r>
-              <w:t xml:space="preserve">Dar </w:t>
+              <w:t>Dar</w:t>
+            </w:r>
+            <w:r>
+              <w:t>/quitar</w:t>
+            </w:r>
+            <w:r>
+              <w:t xml:space="preserve"> </w:t>
             </w:r>
             <w:proofErr w:type="spellStart"/>
             <w:r>
@@ -3649,7 +3905,91 @@
           <w:tcPr>
             <w:tcW w:w="4247" w:type="dxa"/>
           </w:tcPr>
-          <w:p/>
+          <w:p>
+            <w:r>
+              <w:t>El usuario interactúa con el botón de "Me gusta" de una reseña para mostrar su aprecio o retirarlo.</w:t>
+            </w:r>
+          </w:p>
+        </w:tc>
+      </w:tr>
+      <w:tr>
+        <w:tc>
+          <w:tcPr>
+            <w:tcW w:w="4247" w:type="dxa"/>
+          </w:tcPr>
+          <w:p>
+            <w:pPr>
+              <w:rPr>
+                <w:b/>
+                <w:bCs/>
+              </w:rPr>
+            </w:pPr>
+            <w:r>
+              <w:rPr>
+                <w:b/>
+                <w:bCs/>
+              </w:rPr>
+              <w:t>ACTORES</w:t>
+            </w:r>
+          </w:p>
+        </w:tc>
+        <w:tc>
+          <w:tcPr>
+            <w:tcW w:w="4247" w:type="dxa"/>
+          </w:tcPr>
+          <w:p>
+            <w:r>
+              <w:t>Usuario Registrado</w:t>
+            </w:r>
+          </w:p>
+        </w:tc>
+      </w:tr>
+      <w:tr>
+        <w:tc>
+          <w:tcPr>
+            <w:tcW w:w="4247" w:type="dxa"/>
+          </w:tcPr>
+          <w:p>
+            <w:pPr>
+              <w:rPr>
+                <w:b/>
+                <w:bCs/>
+              </w:rPr>
+            </w:pPr>
+            <w:r>
+              <w:rPr>
+                <w:b/>
+                <w:bCs/>
+              </w:rPr>
+              <w:t>PRECONDICIONES</w:t>
+            </w:r>
+          </w:p>
+        </w:tc>
+        <w:tc>
+          <w:tcPr>
+            <w:tcW w:w="4247" w:type="dxa"/>
+          </w:tcPr>
+          <w:p>
+            <w:pPr>
+              <w:tabs>
+                <w:tab w:val="left" w:pos="1311"/>
+              </w:tabs>
+            </w:pPr>
+            <w:r>
+              <w:t xml:space="preserve">El usuario debe </w:t>
+            </w:r>
+            <w:r>
+              <w:t xml:space="preserve">visualizar la </w:t>
+            </w:r>
+            <w:proofErr w:type="spellStart"/>
+            <w:r>
+              <w:t>review</w:t>
+            </w:r>
+            <w:proofErr w:type="spellEnd"/>
+            <w:r>
+              <w:t>.</w:t>
+            </w:r>
+          </w:p>
         </w:tc>
       </w:tr>
       <w:tr>
@@ -3670,62 +4010,6 @@
                 <w:bCs/>
               </w:rPr>
               <w:lastRenderedPageBreak/>
-              <w:t>ACTORES</w:t>
-            </w:r>
-          </w:p>
-        </w:tc>
-        <w:tc>
-          <w:tcPr>
-            <w:tcW w:w="4247" w:type="dxa"/>
-          </w:tcPr>
-          <w:p/>
-        </w:tc>
-      </w:tr>
-      <w:tr>
-        <w:tc>
-          <w:tcPr>
-            <w:tcW w:w="4247" w:type="dxa"/>
-          </w:tcPr>
-          <w:p>
-            <w:pPr>
-              <w:rPr>
-                <w:b/>
-                <w:bCs/>
-              </w:rPr>
-            </w:pPr>
-            <w:r>
-              <w:rPr>
-                <w:b/>
-                <w:bCs/>
-              </w:rPr>
-              <w:t>PRECONDICIONES</w:t>
-            </w:r>
-          </w:p>
-        </w:tc>
-        <w:tc>
-          <w:tcPr>
-            <w:tcW w:w="4247" w:type="dxa"/>
-          </w:tcPr>
-          <w:p/>
-        </w:tc>
-      </w:tr>
-      <w:tr>
-        <w:tc>
-          <w:tcPr>
-            <w:tcW w:w="4247" w:type="dxa"/>
-          </w:tcPr>
-          <w:p>
-            <w:pPr>
-              <w:rPr>
-                <w:b/>
-                <w:bCs/>
-              </w:rPr>
-            </w:pPr>
-            <w:r>
-              <w:rPr>
-                <w:b/>
-                <w:bCs/>
-              </w:rPr>
               <w:t>SECUENCIA NORMAL</w:t>
             </w:r>
           </w:p>
@@ -3742,6 +4026,151 @@
                 <w:numId w:val="12"/>
               </w:numPr>
             </w:pPr>
+            <w:r>
+              <w:t>El usuario hace clic en el botón de Like de una reseña</w:t>
+            </w:r>
+            <w:r>
+              <w:t xml:space="preserve"> </w:t>
+            </w:r>
+            <w:r>
+              <w:t>específica.</w:t>
+            </w:r>
+            <w:r>
+              <w:br/>
+            </w:r>
+          </w:p>
+          <w:p>
+            <w:pPr>
+              <w:pStyle w:val="Prrafodelista"/>
+              <w:numPr>
+                <w:ilvl w:val="0"/>
+                <w:numId w:val="12"/>
+              </w:numPr>
+            </w:pPr>
+            <w:r>
+              <w:t xml:space="preserve">El sistema comprueba en el almacenamiento local si el usuario ya le había dado </w:t>
+            </w:r>
+            <w:proofErr w:type="spellStart"/>
+            <w:r>
+              <w:t>like</w:t>
+            </w:r>
+            <w:proofErr w:type="spellEnd"/>
+            <w:r>
+              <w:t xml:space="preserve"> previamente.</w:t>
+            </w:r>
+            <w:r>
+              <w:br/>
+            </w:r>
+          </w:p>
+          <w:p>
+            <w:pPr>
+              <w:pStyle w:val="Prrafodelista"/>
+              <w:numPr>
+                <w:ilvl w:val="0"/>
+                <w:numId w:val="12"/>
+              </w:numPr>
+            </w:pPr>
+            <w:r>
+              <w:t xml:space="preserve">El sistema determina el </w:t>
+            </w:r>
+            <w:proofErr w:type="spellStart"/>
+            <w:r>
+              <w:rPr>
+                <w:i/>
+                <w:iCs/>
+              </w:rPr>
+              <w:t>endpoint</w:t>
+            </w:r>
+            <w:proofErr w:type="spellEnd"/>
+            <w:r>
+              <w:t xml:space="preserve"> correcto (/</w:t>
+            </w:r>
+            <w:proofErr w:type="spellStart"/>
+            <w:r>
+              <w:t>like</w:t>
+            </w:r>
+            <w:proofErr w:type="spellEnd"/>
+            <w:r>
+              <w:t xml:space="preserve"> o /</w:t>
+            </w:r>
+            <w:proofErr w:type="spellStart"/>
+            <w:r>
+              <w:t>unlike</w:t>
+            </w:r>
+            <w:proofErr w:type="spellEnd"/>
+            <w:r>
+              <w:t>).</w:t>
+            </w:r>
+            <w:r>
+              <w:br/>
+            </w:r>
+          </w:p>
+          <w:p>
+            <w:pPr>
+              <w:pStyle w:val="Prrafodelista"/>
+              <w:numPr>
+                <w:ilvl w:val="0"/>
+                <w:numId w:val="12"/>
+              </w:numPr>
+            </w:pPr>
+            <w:r>
+              <w:t>El sistema envía una petición PUT al servidor.</w:t>
+            </w:r>
+            <w:r>
+              <w:br/>
+            </w:r>
+          </w:p>
+          <w:p>
+            <w:pPr>
+              <w:pStyle w:val="Prrafodelista"/>
+              <w:numPr>
+                <w:ilvl w:val="0"/>
+                <w:numId w:val="12"/>
+              </w:numPr>
+            </w:pPr>
+            <w:r>
+              <w:t>El servidor actualiza el contador en la base de datos y responde afirmativamente.</w:t>
+            </w:r>
+            <w:r>
+              <w:br/>
+            </w:r>
+          </w:p>
+          <w:p>
+            <w:pPr>
+              <w:pStyle w:val="Prrafodelista"/>
+              <w:numPr>
+                <w:ilvl w:val="0"/>
+                <w:numId w:val="12"/>
+              </w:numPr>
+            </w:pPr>
+            <w:r>
+              <w:t xml:space="preserve">El sistema actualiza el registro local guardando o eliminando el ID de la reseña en </w:t>
+            </w:r>
+            <w:proofErr w:type="spellStart"/>
+            <w:r>
+              <w:t>localStorage</w:t>
+            </w:r>
+            <w:proofErr w:type="spellEnd"/>
+            <w:r>
+              <w:t>.</w:t>
+            </w:r>
+          </w:p>
+          <w:p>
+            <w:pPr>
+              <w:pStyle w:val="Prrafodelista"/>
+            </w:pPr>
+          </w:p>
+          <w:p>
+            <w:pPr>
+              <w:pStyle w:val="Prrafodelista"/>
+              <w:numPr>
+                <w:ilvl w:val="0"/>
+                <w:numId w:val="12"/>
+              </w:numPr>
+            </w:pPr>
+            <w:r>
+              <w:t>El sistema actualiza el estado sumando o restando 1 al contador visualmente e invirtiendo el icono al instante.</w:t>
+            </w:r>
           </w:p>
         </w:tc>
       </w:tr>
@@ -3770,7 +4199,16 @@
           <w:tcPr>
             <w:tcW w:w="4247" w:type="dxa"/>
           </w:tcPr>
-          <w:p/>
+          <w:p>
+            <w:pPr>
+              <w:tabs>
+                <w:tab w:val="left" w:pos="1532"/>
+              </w:tabs>
+            </w:pPr>
+            <w:r>
+              <w:t>El contador de la reseña se actualiza en el servidor y la interfaz refleja el cambio sin recargar la página.</w:t>
+            </w:r>
+          </w:p>
         </w:tc>
       </w:tr>
       <w:tr>
@@ -3798,7 +4236,25 @@
           <w:tcPr>
             <w:tcW w:w="4247" w:type="dxa"/>
           </w:tcPr>
-          <w:p/>
+          <w:p>
+            <w:pPr>
+              <w:pStyle w:val="Prrafodelista"/>
+              <w:numPr>
+                <w:ilvl w:val="0"/>
+                <w:numId w:val="2"/>
+              </w:numPr>
+            </w:pPr>
+            <w:r>
+              <w:rPr>
+                <w:b/>
+                <w:bCs/>
+              </w:rPr>
+              <w:t>Error del servidor / Red:</w:t>
+            </w:r>
+            <w:r>
+              <w:t xml:space="preserve"> Si la petición falla, el sistema captura el error por consola pero la interfaz gráfica no se altera (se cancela el proceso).</w:t>
+            </w:r>
+          </w:p>
         </w:tc>
       </w:tr>
     </w:tbl>
@@ -3870,7 +4326,19 @@
           <w:tcPr>
             <w:tcW w:w="4247" w:type="dxa"/>
           </w:tcPr>
-          <w:p/>
+          <w:p>
+            <w:pPr>
+              <w:tabs>
+                <w:tab w:val="left" w:pos="1126"/>
+              </w:tabs>
+            </w:pPr>
+            <w:r>
+              <w:t>Un usuario autenticado busca a otro usuario en la plataforma y pulsa el botón para empezar a seguirlo</w:t>
+            </w:r>
+            <w:r>
+              <w:t>.</w:t>
+            </w:r>
+          </w:p>
         </w:tc>
       </w:tr>
       <w:tr>
@@ -3898,7 +4366,11 @@
           <w:tcPr>
             <w:tcW w:w="4247" w:type="dxa"/>
           </w:tcPr>
-          <w:p/>
+          <w:p>
+            <w:r>
+              <w:t>Usuario Registrado</w:t>
+            </w:r>
+          </w:p>
         </w:tc>
       </w:tr>
       <w:tr>
@@ -3926,26 +4398,39 @@
           <w:tcPr>
             <w:tcW w:w="4247" w:type="dxa"/>
           </w:tcPr>
-          <w:p/>
-        </w:tc>
-      </w:tr>
-      <w:tr>
-        <w:tc>
-          <w:tcPr>
-            <w:tcW w:w="4247" w:type="dxa"/>
-          </w:tcPr>
-          <w:p>
-            <w:pPr>
-              <w:rPr>
-                <w:b/>
-                <w:bCs/>
-              </w:rPr>
-            </w:pPr>
-            <w:r>
-              <w:rPr>
-                <w:b/>
-                <w:bCs/>
-              </w:rPr>
+          <w:p>
+            <w:r>
+              <w:t>El usuario debe haber iniciado sesión y estar en la pantalla de "Amigos" (/</w:t>
+            </w:r>
+            <w:proofErr w:type="spellStart"/>
+            <w:r>
+              <w:t>friends</w:t>
+            </w:r>
+            <w:proofErr w:type="spellEnd"/>
+            <w:r>
+              <w:t>).</w:t>
+            </w:r>
+          </w:p>
+        </w:tc>
+      </w:tr>
+      <w:tr>
+        <w:tc>
+          <w:tcPr>
+            <w:tcW w:w="4247" w:type="dxa"/>
+          </w:tcPr>
+          <w:p>
+            <w:pPr>
+              <w:rPr>
+                <w:b/>
+                <w:bCs/>
+              </w:rPr>
+            </w:pPr>
+            <w:r>
+              <w:rPr>
+                <w:b/>
+                <w:bCs/>
+              </w:rPr>
+              <w:lastRenderedPageBreak/>
               <w:t>SECUENCIA NORMAL</w:t>
             </w:r>
           </w:p>
@@ -3962,6 +4447,90 @@
                 <w:numId w:val="13"/>
               </w:numPr>
             </w:pPr>
+            <w:r>
+              <w:t>El usuario introduce el nombre en el buscador o visualiza su lista de seguidores.</w:t>
+            </w:r>
+            <w:r>
+              <w:br/>
+            </w:r>
+          </w:p>
+          <w:p>
+            <w:pPr>
+              <w:pStyle w:val="Prrafodelista"/>
+              <w:numPr>
+                <w:ilvl w:val="0"/>
+                <w:numId w:val="13"/>
+              </w:numPr>
+            </w:pPr>
+            <w:r>
+              <w:t>El usuario hace clic en el botón "Seguir" junto al nombre de otro usuario.</w:t>
+            </w:r>
+            <w:r>
+              <w:br/>
+            </w:r>
+          </w:p>
+          <w:p>
+            <w:pPr>
+              <w:pStyle w:val="Prrafodelista"/>
+              <w:numPr>
+                <w:ilvl w:val="0"/>
+                <w:numId w:val="13"/>
+              </w:numPr>
+            </w:pPr>
+            <w:r>
+              <w:t>El sistema limpia errores previos y realiza una petición POST enviando el ID del usuario a seguir.</w:t>
+            </w:r>
+            <w:r>
+              <w:br/>
+            </w:r>
+          </w:p>
+          <w:p>
+            <w:pPr>
+              <w:pStyle w:val="Prrafodelista"/>
+              <w:numPr>
+                <w:ilvl w:val="0"/>
+                <w:numId w:val="13"/>
+              </w:numPr>
+            </w:pPr>
+            <w:r>
+              <w:t>El servidor registra la relación (seguidor-seguido) en la base de datos y responde con éxito.</w:t>
+            </w:r>
+            <w:r>
+              <w:br/>
+            </w:r>
+          </w:p>
+          <w:p>
+            <w:pPr>
+              <w:pStyle w:val="Prrafodelista"/>
+              <w:numPr>
+                <w:ilvl w:val="0"/>
+                <w:numId w:val="13"/>
+              </w:numPr>
+            </w:pPr>
+            <w:r>
+              <w:t>El sistema actualiza el estado local cambiando el estado del botón a "Dejar de seguir".</w:t>
+            </w:r>
+            <w:r>
+              <w:br/>
+            </w:r>
+          </w:p>
+          <w:p>
+            <w:pPr>
+              <w:pStyle w:val="Prrafodelista"/>
+              <w:numPr>
+                <w:ilvl w:val="0"/>
+                <w:numId w:val="13"/>
+              </w:numPr>
+            </w:pPr>
+            <w:r>
+              <w:t xml:space="preserve">El sistema </w:t>
+            </w:r>
+            <w:r>
+              <w:t>recarga</w:t>
+            </w:r>
+            <w:r>
+              <w:t xml:space="preserve"> la lista de "Siguiendo" y "Seguidores" actualizada desde el servidor.</w:t>
+            </w:r>
           </w:p>
         </w:tc>
       </w:tr>
@@ -3990,7 +4559,11 @@
           <w:tcPr>
             <w:tcW w:w="4247" w:type="dxa"/>
           </w:tcPr>
-          <w:p/>
+          <w:p>
+            <w:r>
+              <w:t>El usuario pasa a seguir al usuario seleccionado y las listas de la interfaz se actualizan.</w:t>
+            </w:r>
+          </w:p>
         </w:tc>
       </w:tr>
       <w:tr>
@@ -4018,7 +4591,92 @@
           <w:tcPr>
             <w:tcW w:w="4247" w:type="dxa"/>
           </w:tcPr>
-          <w:p/>
+          <w:p>
+            <w:pPr>
+              <w:pStyle w:val="Prrafodelista"/>
+              <w:numPr>
+                <w:ilvl w:val="0"/>
+                <w:numId w:val="2"/>
+              </w:numPr>
+            </w:pPr>
+            <w:r>
+              <w:rPr>
+                <w:b/>
+                <w:bCs/>
+              </w:rPr>
+              <w:t xml:space="preserve">Usuario no </w:t>
+            </w:r>
+            <w:proofErr w:type="spellStart"/>
+            <w:r>
+              <w:rPr>
+                <w:b/>
+                <w:bCs/>
+              </w:rPr>
+              <w:t>logueado</w:t>
+            </w:r>
+            <w:proofErr w:type="spellEnd"/>
+            <w:r>
+              <w:rPr>
+                <w:b/>
+                <w:bCs/>
+              </w:rPr>
+              <w:t>:</w:t>
+            </w:r>
+            <w:r>
+              <w:t xml:space="preserve"> Si no hay un </w:t>
+            </w:r>
+            <w:proofErr w:type="spellStart"/>
+            <w:r>
+              <w:t>user.id</w:t>
+            </w:r>
+            <w:proofErr w:type="spellEnd"/>
+            <w:r>
+              <w:t xml:space="preserve">, el sistema muestra el error </w:t>
+            </w:r>
+            <w:r>
+              <w:rPr>
+                <w:i/>
+                <w:iCs/>
+              </w:rPr>
+              <w:t>"Debes iniciar sesión..."</w:t>
+            </w:r>
+            <w:r>
+              <w:t xml:space="preserve"> al cargar la página.</w:t>
+            </w:r>
+          </w:p>
+          <w:p>
+            <w:pPr>
+              <w:pStyle w:val="Prrafodelista"/>
+            </w:pPr>
+          </w:p>
+          <w:p>
+            <w:pPr>
+              <w:pStyle w:val="Prrafodelista"/>
+              <w:numPr>
+                <w:ilvl w:val="0"/>
+                <w:numId w:val="2"/>
+              </w:numPr>
+            </w:pPr>
+            <w:r>
+              <w:rPr>
+                <w:b/>
+                <w:bCs/>
+              </w:rPr>
+              <w:t>Error de servidor/red al seguir:</w:t>
+            </w:r>
+            <w:r>
+              <w:t xml:space="preserve"> Si la petición POST falla</w:t>
+            </w:r>
+            <w:r>
+              <w:t>,</w:t>
+            </w:r>
+            <w:r>
+              <w:t xml:space="preserve"> el sistema captura el error y muestra el mensaje</w:t>
+            </w:r>
+            <w:r>
+              <w:t>.</w:t>
+            </w:r>
+          </w:p>
         </w:tc>
       </w:tr>
     </w:tbl>

</xml_diff>